<commit_message>
Update all study documents for Amendment A1 and the results; add PDFs and docs index
- Project Handbook v1.1: E10, F12-F13, G15-G17, H9-H10, glossary, limitations, viva, file map; new pipeline figure
- Research Plan v1.4: status, results (Section 12), 5.14 exploratory extensions, corrected claims and reading lists
- Chapter 2 Blueprint: sources for E1/E2, must-cite papers, Gallagher & Twomey (1998) correction
- Literature Handbook v2: 5 new cards, C6 primer with 3 figures, Part F -> Part G cross-reference fix
- Literature Search Guide: exploratory rows, papers found later, corrections marked as applied
- Public copies exclude personal planning content (PhD applications, contacts, integrity notes); full
  copies are kept locally in private/ (gitignored)
- PDFs regenerated with docs/make_pdfs.ps1; pipeline diagram shows the exploratory step

Co-Authored-By: Claude Opus 5.5 <noreply@anthropic.com>
</commit_message>
<xml_diff>
--- a/docs/Chapter2_Literature_Review_Blueprint.docx
+++ b/docs/Chapter2_Literature_Review_Blueprint.docx
@@ -29,7 +29,7 @@
         <w:rPr>
           <w:i/>
         </w:rPr>
-        <w:t>Companion to the Research Plan v1.2 · 24 September 2026 · sample January 2003 – August 2023</w:t>
+        <w:t>Companion to the Research Plan v1.4 · 24 September 2026, updated 30 September 2026 · sample January 2003 – August 2023</w:t>
       </w:r>
     </w:p>
     <w:tbl>
@@ -55,6 +55,40 @@
             </w:r>
             <w:r>
               <w:t>This blueprint tells you what each section must argue and which sources support it. It deliberately contains no ready-made paragraphs. Read the sources, form your own view and write every sentence yourself. ✔ marks references whose details were confirmed online in this session; confirm all others in the DBS library before citing.</w:t>
+            </w:r>
+          </w:p>
+        </w:tc>
+      </w:tr>
+    </w:tbl>
+    <w:p>
+      <w:pPr>
+        <w:spacing w:after="40"/>
+      </w:pPr>
+    </w:p>
+    <w:tbl>
+      <w:tblPr>
+        <w:tblW w:type="auto" w:w="0"/>
+        <w:tblLook w:firstColumn="1" w:firstRow="1" w:lastColumn="0" w:lastRow="0" w:noHBand="0" w:noVBand="1" w:val="04A0"/>
+      </w:tblPr>
+      <w:tblGrid>
+        <w:gridCol w:w="9972"/>
+      </w:tblGrid>
+      <w:tr>
+        <w:tc>
+          <w:tcPr>
+            <w:tcW w:type="dxa" w:w="9972"/>
+            <w:shd w:val="clear" w:color="auto" w:fill="FFF2CC"/>
+          </w:tcPr>
+          <w:p>
+            <w:r>
+              <w:rPr>
+                <w:b/>
+              </w:rPr>
+              <w:t xml:space="preserve">Updated 30 September 2026: </w:t>
+            </w:r>
+            <w:r>
+              <w:rPr/>
+              <w:t xml:space="preserve">(1) your results are in — use them to decide what 2.7 must set up, but keep Chapter 2 about the literature; (2) two exploratory extensions were added through Amendment A1 (Diebold–Yilmaz spillovers vs SHAP; the volatility paradox) — they get short literature support in 2.2 and 2.4 and are reported in Chapters 3–4; (3) correction: Gallagher &amp; Twomey (1998), not Twomey (1998); (4) two new must-cite papers (Feng, Shi &amp; Kutan, 2026; Brini, 2026); (5) the Literature Search Guide (28 Sep) adds about 45 papers by section — its IDs (A1…E5) are referred to below.</w:t>
             </w:r>
           </w:p>
         </w:tc>
@@ -486,8 +520,9 @@
             <w:r>
               <w:rPr>
                 <w:sz w:val="17"/>
-              </w:rPr>
-              <w:t>Descriptives, RQ1 accuracy tables, RQ3 frozen models, RQ2 fingerprints, RQ4 stability, validation events, robustness</w:t>
+                <w:b w:val="0"/>
+              </w:rPr>
+              <w:t xml:space="preserve">Descriptives, RQ1 accuracy tables, RQ3 frozen models, RQ2 fingerprints, RQ4 stability, validation events, robustness; exploratory extensions (Amendment A1)</w:t>
             </w:r>
           </w:p>
         </w:tc>
@@ -553,8 +588,9 @@
             <w:r>
               <w:rPr>
                 <w:sz w:val="17"/>
-              </w:rPr>
-              <w:t>Findings against hypotheses and literature; history lens; implications for investors, regulators, researchers</w:t>
+                <w:b w:val="0"/>
+              </w:rPr>
+              <w:t xml:space="preserve">Findings against hypotheses and literature; history lens; implications for investors, regulators, researchers; what the exploratory checks add (two lenses on transmission; calm before crises)</w:t>
             </w:r>
           </w:p>
         </w:tc>
@@ -1418,6 +1454,66 @@
                 <w:sz w:val="17"/>
               </w:rPr>
               <w:t>(COVID-19 OR Brexit OR "Ukraine") AND (contagion OR "volatility spillover")</w:t>
+            </w:r>
+          </w:p>
+        </w:tc>
+      </w:tr>
+      <w:tr>
+        <w:tc>
+          <w:tcPr>
+            <w:tcW w:type="dxa" w:w="1984"/>
+          </w:tcPr>
+          <w:p>
+            <w:r>
+              <w:rPr>
+                <w:sz w:val="17"/>
+                <w:b w:val="0"/>
+              </w:rPr>
+              <w:t xml:space="preserve">Exploratory E1</w:t>
+            </w:r>
+          </w:p>
+        </w:tc>
+        <w:tc>
+          <w:tcPr>
+            <w:tcW w:type="dxa" w:w="7654"/>
+          </w:tcPr>
+          <w:p>
+            <w:r>
+              <w:rPr>
+                <w:sz w:val="17"/>
+                <w:b w:val="0"/>
+              </w:rPr>
+              <w:t xml:space="preserve">("spillover index" OR connectedness OR "variance decomposition") AND (SHAP OR "explainable" OR "interpretable machine learning") AND volatility</w:t>
+            </w:r>
+          </w:p>
+        </w:tc>
+      </w:tr>
+      <w:tr>
+        <w:tc>
+          <w:tcPr>
+            <w:tcW w:type="dxa" w:w="1984"/>
+          </w:tcPr>
+          <w:p>
+            <w:r>
+              <w:rPr>
+                <w:sz w:val="17"/>
+                <w:b w:val="0"/>
+              </w:rPr>
+              <w:t xml:space="preserve">Exploratory E2</w:t>
+            </w:r>
+          </w:p>
+        </w:tc>
+        <w:tc>
+          <w:tcPr>
+            <w:tcW w:type="dxa" w:w="7654"/>
+          </w:tcPr>
+          <w:p>
+            <w:r>
+              <w:rPr>
+                <w:sz w:val="17"/>
+                <w:b w:val="0"/>
+              </w:rPr>
+              <w:t xml:space="preserve">("low volatility" OR "volatility paradox" OR "stability is destabilizing") AND ("banking crisis" OR "financial crisis")</w:t>
             </w:r>
           </w:p>
         </w:tc>
@@ -1724,6 +1820,16 @@
         <w:spacing w:after="20"/>
       </w:pPr>
       <w:r>
+        <w:rPr/>
+        <w:t xml:space="preserve">The volatility paradox: Danielsson, Valenzuela &amp; Zer (2018) turn Minsky’s idea into a measurable claim — across 60 countries and up to 211 years, prolonged below-trend volatility (not high volatility) preceded banking crises, through credit growth and leverage. One or two sentences here give your Minsky framing an empirical anchor; your exploratory E2 is reported in Chapter 4, not here.</w:t>
+      </w:r>
+    </w:p>
+    <w:p>
+      <w:pPr>
+        <w:pStyle w:val="ListBullet"/>
+        <w:spacing w:after="20"/>
+      </w:pPr>
+      <w:r>
         <w:t>Kindleberger’s anatomy of crises (displacement, boom, euphoria, distress, panic).</w:t>
       </w:r>
     </w:p>
@@ -1974,6 +2080,36 @@
           </w:p>
         </w:tc>
       </w:tr>
+      <w:tr>
+        <w:tc>
+          <w:tcPr>
+            <w:tcW w:type="dxa" w:w="3685"/>
+          </w:tcPr>
+          <w:p>
+            <w:r>
+              <w:rPr>
+                <w:sz w:val="17"/>
+                <w:b w:val="0"/>
+              </w:rPr>
+              <w:t xml:space="preserve">Danielsson, Valenzuela &amp; Zer (2018) RFS 31(7) ✔</w:t>
+            </w:r>
+          </w:p>
+        </w:tc>
+        <w:tc>
+          <w:tcPr>
+            <w:tcW w:type="dxa" w:w="5953"/>
+          </w:tcPr>
+          <w:p>
+            <w:r>
+              <w:rPr>
+                <w:sz w:val="17"/>
+                <w:b w:val="0"/>
+              </w:rPr>
+              <w:t xml:space="preserve">the volatility paradox: evidence that calm precedes banking crises; basis of exploratory E2</w:t>
+            </w:r>
+          </w:p>
+        </w:tc>
+      </w:tr>
     </w:tbl>
     <w:p>
       <w:pPr>
@@ -2227,8 +2363,9 @@
             <w:r>
               <w:rPr>
                 <w:sz w:val="17"/>
-              </w:rPr>
-              <w:t>Twomey (1998) Economic and Social Review ✔ partial</w:t>
+                <w:b w:val="0"/>
+              </w:rPr>
+              <w:t xml:space="preserve">Gallagher &amp; Twomey (1998) ESR 29(4) ✔</w:t>
             </w:r>
           </w:p>
         </w:tc>
@@ -2661,6 +2798,16 @@
       </w:pPr>
       <w:r>
         <w:t>Measurement toolkit: correlation and DCC-GARCH, BEKK, factor models, spillover indices (Diebold–Yilmaz), and recent deep-learning early-warning approaches.</w:t>
+      </w:r>
+    </w:p>
+    <w:p>
+      <w:pPr>
+        <w:pStyle w:val="ListBullet"/>
+        <w:spacing w:after="20"/>
+      </w:pPr>
+      <w:r>
+        <w:rPr/>
+        <w:t xml:space="preserve">Spillover (connectedness) indices in more detail: Diebold &amp; Yilmaz (2009) use VAR variance decompositions; their 2012 version uses a generalized decomposition (Pesaran &amp; Shin, 1998) that does not depend on the order of the variables and adds directional and net measures; time-varying (TVP-VAR) versions are now common in Irish finance research. Applications that include Ireland: Search Guide B5 (Mensi et al., 2018), B7 (Aslam et al., 2021), B9 (Gołąb &amp; Zamojska, 2019). This is the method of your exploratory E1.</w:t>
       </w:r>
     </w:p>
     <w:p>
@@ -2979,8 +3126,99 @@
             <w:r>
               <w:rPr>
                 <w:sz w:val="17"/>
-              </w:rPr>
-              <w:t>spillover index (name it as the PhD validation step)</w:t>
+                <w:b w:val="0"/>
+              </w:rPr>
+              <w:t xml:space="preserve">spillover index; the 2012 set-up (daily range volatility, VAR(4), 10-day horizon, 200-day windows ✔ full text) is the method of exploratory E1</w:t>
+            </w:r>
+          </w:p>
+        </w:tc>
+      </w:tr>
+      <w:tr>
+        <w:tc>
+          <w:tcPr>
+            <w:tcW w:type="dxa" w:w="3685"/>
+          </w:tcPr>
+          <w:p>
+            <w:r>
+              <w:rPr>
+                <w:sz w:val="17"/>
+                <w:b w:val="0"/>
+              </w:rPr>
+              <w:t xml:space="preserve">Pesaran &amp; Shin (1998) Economics Letters 58(1)</w:t>
+            </w:r>
+          </w:p>
+        </w:tc>
+        <w:tc>
+          <w:tcPr>
+            <w:tcW w:type="dxa" w:w="5953"/>
+          </w:tcPr>
+          <w:p>
+            <w:r>
+              <w:rPr>
+                <w:sz w:val="17"/>
+                <w:b w:val="0"/>
+              </w:rPr>
+              <w:t xml:space="preserve">the generalized (order-invariant) variance decomposition behind DY (2012)</w:t>
+            </w:r>
+          </w:p>
+        </w:tc>
+      </w:tr>
+      <w:tr>
+        <w:tc>
+          <w:tcPr>
+            <w:tcW w:type="dxa" w:w="3685"/>
+          </w:tcPr>
+          <w:p>
+            <w:r>
+              <w:rPr>
+                <w:sz w:val="17"/>
+                <w:b w:val="0"/>
+              </w:rPr>
+              <w:t xml:space="preserve">Antonakakis, Chatziantoniou &amp; Gabauer (2020) JRFM 13(4)</w:t>
+            </w:r>
+          </w:p>
+        </w:tc>
+        <w:tc>
+          <w:tcPr>
+            <w:tcW w:type="dxa" w:w="5953"/>
+          </w:tcPr>
+          <w:p>
+            <w:r>
+              <w:rPr>
+                <w:sz w:val="17"/>
+                <w:b w:val="0"/>
+              </w:rPr>
+              <w:t xml:space="preserve">TVP-VAR connectedness — name it as the PhD extension</w:t>
+            </w:r>
+          </w:p>
+        </w:tc>
+      </w:tr>
+      <w:tr>
+        <w:tc>
+          <w:tcPr>
+            <w:tcW w:type="dxa" w:w="3685"/>
+          </w:tcPr>
+          <w:p>
+            <w:r>
+              <w:rPr>
+                <w:sz w:val="17"/>
+                <w:b w:val="0"/>
+              </w:rPr>
+              <w:t xml:space="preserve">Search Guide B5, B7, B9</w:t>
+            </w:r>
+          </w:p>
+        </w:tc>
+        <w:tc>
+          <w:tcPr>
+            <w:tcW w:type="dxa" w:w="5953"/>
+          </w:tcPr>
+          <w:p>
+            <w:r>
+              <w:rPr>
+                <w:sz w:val="17"/>
+                <w:b w:val="0"/>
+              </w:rPr>
+              <w:t xml:space="preserve">DY applications that include Ireland (read before writing 2.4)</w:t>
             </w:r>
           </w:p>
         </w:tc>
@@ -3034,6 +3272,9 @@
           <w:i w:val="0"/>
         </w:rPr>
         <w:t>No single method is agreed; each captures a different notion of transmission. None uses the explanations of a forecasting model as evidence about channels. That is your methodological contribution.</w:t>
+      </w:r>
+      <w:r>
+        <w:t xml:space="preserve"> Planning note: your exploratory E1 shows the point on your own data — a VAR spillover measure and the SHAP shares agreed only weakly — so say which notion of transmission each measures.</w:t>
       </w:r>
     </w:p>
     <w:p>
@@ -3639,6 +3880,66 @@
           </w:p>
         </w:tc>
       </w:tr>
+      <w:tr>
+        <w:tc>
+          <w:tcPr>
+            <w:tcW w:type="dxa" w:w="3685"/>
+          </w:tcPr>
+          <w:p>
+            <w:r>
+              <w:rPr>
+                <w:sz w:val="17"/>
+                <w:b w:val="0"/>
+              </w:rPr>
+              <w:t xml:space="preserve">Search Guide C1–C3: Audrino &amp; Chassot (2025) IJF; Kılıç (2025); Rahimikia &amp; Poon</w:t>
+            </w:r>
+          </w:p>
+        </w:tc>
+        <w:tc>
+          <w:tcPr>
+            <w:tcW w:type="dxa" w:w="5953"/>
+          </w:tcPr>
+          <w:p>
+            <w:r>
+              <w:rPr>
+                <w:sz w:val="17"/>
+                <w:b w:val="0"/>
+              </w:rPr>
+              <w:t xml:space="preserve">published evidence that HAR-type models often beat ML — company for your H1 result</w:t>
+            </w:r>
+          </w:p>
+        </w:tc>
+      </w:tr>
+      <w:tr>
+        <w:tc>
+          <w:tcPr>
+            <w:tcW w:type="dxa" w:w="3685"/>
+          </w:tcPr>
+          <w:p>
+            <w:r>
+              <w:rPr>
+                <w:sz w:val="17"/>
+                <w:b w:val="0"/>
+              </w:rPr>
+              <w:t xml:space="preserve">Brini (2026) arXiv 2607.05291 ✔ (preprint)</w:t>
+            </w:r>
+          </w:p>
+        </w:tc>
+        <w:tc>
+          <w:tcPr>
+            <w:tcW w:type="dxa" w:w="5953"/>
+          </w:tcPr>
+          <w:p>
+            <w:r>
+              <w:rPr>
+                <w:sz w:val="17"/>
+                <w:b w:val="0"/>
+              </w:rPr>
+              <w:t xml:space="preserve">nine time-series foundation models vs HAR on 50 assets: no general advantage; an average of a small model and log-HAR most robust</w:t>
+            </w:r>
+          </w:p>
+        </w:tc>
+      </w:tr>
     </w:tbl>
     <w:p>
       <w:pPr>
@@ -4070,6 +4371,66 @@
           </w:p>
         </w:tc>
       </w:tr>
+      <w:tr>
+        <w:tc>
+          <w:tcPr>
+            <w:tcW w:type="dxa" w:w="3685"/>
+          </w:tcPr>
+          <w:p>
+            <w:r>
+              <w:rPr>
+                <w:sz w:val="17"/>
+                <w:b w:val="0"/>
+              </w:rPr>
+              <w:t xml:space="preserve">Feng, Shi &amp; Kutan (2026) JIMF 160, 103467 ✔</w:t>
+            </w:r>
+          </w:p>
+        </w:tc>
+        <w:tc>
+          <w:tcPr>
+            <w:tcW w:type="dxa" w:w="5953"/>
+          </w:tcPr>
+          <w:p>
+            <w:r>
+              <w:rPr>
+                <w:sz w:val="17"/>
+                <w:b w:val="0"/>
+              </w:rPr>
+              <w:t xml:space="preserve">interpretable ML for cross-market volatility forecasting (VIX and non-VIX indices; US, Germany, Japan, Hong Kong, China, India; 2015–2024) — the closest recent work in spirit; must cite</w:t>
+            </w:r>
+          </w:p>
+        </w:tc>
+      </w:tr>
+      <w:tr>
+        <w:tc>
+          <w:tcPr>
+            <w:tcW w:type="dxa" w:w="3685"/>
+          </w:tcPr>
+          <w:p>
+            <w:r>
+              <w:rPr>
+                <w:sz w:val="17"/>
+                <w:b w:val="0"/>
+              </w:rPr>
+              <w:t xml:space="preserve">Search Guide E1–E2: Choi, Shin &amp; Shin (2024); Shin, Choi &amp; Shin (2025)</w:t>
+            </w:r>
+          </w:p>
+        </w:tc>
+        <w:tc>
+          <w:tcPr>
+            <w:tcW w:type="dxa" w:w="5953"/>
+          </w:tcPr>
+          <w:p>
+            <w:r>
+              <w:rPr>
+                <w:sz w:val="17"/>
+                <w:b w:val="0"/>
+              </w:rPr>
+              <w:t xml:space="preserve">vector SHAP grouped by region — the closest SHAP method; position your channel shares against it</w:t>
+            </w:r>
+          </w:p>
+        </w:tc>
+      </w:tr>
     </w:tbl>
     <w:p>
       <w:pPr>
@@ -4882,8 +5243,9 @@
             <w:r>
               <w:rPr>
                 <w:sz w:val="17"/>
-              </w:rPr>
-              <w:t>Twomey (1998); Kearney (1998). Competing: Li (2020)</w:t>
+                <w:b w:val="0"/>
+              </w:rPr>
+              <w:t xml:space="preserve">Gallagher &amp; Twomey (1998); Kearney (1998). Competing: Li (2020)</w:t>
             </w:r>
           </w:p>
         </w:tc>
@@ -5072,6 +5434,225 @@
                 <w:sz w:val="17"/>
               </w:rPr>
               <w:t>Rankings change with the seed</w:t>
+            </w:r>
+          </w:p>
+        </w:tc>
+      </w:tr>
+    </w:tbl>
+    <w:p>
+      <w:pPr>
+        <w:spacing w:after="40"/>
+      </w:pPr>
+    </w:p>
+    <w:p>
+      <w:pPr>
+        <w:spacing w:after="80"/>
+      </w:pPr>
+      <w:r>
+        <w:rPr>
+          <w:i w:val="0"/>
+          <w:b/>
+        </w:rPr>
+        <w:t xml:space="preserve">Exploratory extensions (Amendment A1, 30 Sep 2026). </w:t>
+      </w:r>
+      <w:r>
+        <w:rPr>
+          <w:i w:val="0"/>
+        </w:rPr>
+        <w:t xml:space="preserve">Not hypotheses and not part of 2.7: they were added after the results. Give them their literature basis briefly in Chapter 3 and report them in Chapter 4.</w:t>
+      </w:r>
+    </w:p>
+    <w:tbl>
+      <w:tblPr>
+        <w:tblStyle w:val="TableGrid"/>
+        <w:tblW w:type="auto" w:w="0"/>
+        <w:jc w:val="center"/>
+        <w:tblLook w:firstColumn="1" w:firstRow="1" w:lastColumn="0" w:lastRow="0" w:noHBand="0" w:noVBand="1" w:val="04A0"/>
+      </w:tblPr>
+      <w:tblGrid>
+        <w:gridCol w:w="2493"/>
+        <w:gridCol w:w="2493"/>
+        <w:gridCol w:w="2493"/>
+        <w:gridCol w:w="2493"/>
+      </w:tblGrid>
+      <w:tr>
+        <w:tc>
+          <w:tcPr>
+            <w:tcW w:type="dxa" w:w="2494"/>
+            <w:shd w:val="clear" w:color="auto" w:fill="1F4E79"/>
+          </w:tcPr>
+          <w:p>
+            <w:r>
+              <w:rPr>
+                <w:color w:val="FFFFFF"/>
+                <w:sz w:val="17"/>
+                <w:b/>
+              </w:rPr>
+              <w:t xml:space="preserve">Extension</w:t>
+            </w:r>
+          </w:p>
+        </w:tc>
+        <w:tc>
+          <w:tcPr>
+            <w:tcW w:type="dxa" w:w="2608"/>
+            <w:shd w:val="clear" w:color="auto" w:fill="1F4E79"/>
+          </w:tcPr>
+          <w:p>
+            <w:r>
+              <w:rPr>
+                <w:color w:val="FFFFFF"/>
+                <w:sz w:val="17"/>
+                <w:b/>
+              </w:rPr>
+              <w:t xml:space="preserve">Literature basis</w:t>
+            </w:r>
+          </w:p>
+        </w:tc>
+        <w:tc>
+          <w:tcPr>
+            <w:tcW w:type="dxa" w:w="2154"/>
+            <w:shd w:val="clear" w:color="auto" w:fill="1F4E79"/>
+          </w:tcPr>
+          <w:p>
+            <w:r>
+              <w:rPr>
+                <w:color w:val="FFFFFF"/>
+                <w:sz w:val="17"/>
+                <w:b/>
+              </w:rPr>
+              <w:t xml:space="preserve">Expectation written in advance</w:t>
+            </w:r>
+          </w:p>
+        </w:tc>
+        <w:tc>
+          <w:tcPr>
+            <w:tcW w:type="dxa" w:w="2381"/>
+            <w:shd w:val="clear" w:color="auto" w:fill="1F4E79"/>
+          </w:tcPr>
+          <w:p>
+            <w:r>
+              <w:rPr>
+                <w:color w:val="FFFFFF"/>
+                <w:sz w:val="17"/>
+                <w:b/>
+              </w:rPr>
+              <w:t xml:space="preserve">Result that contradicts it</w:t>
+            </w:r>
+          </w:p>
+        </w:tc>
+      </w:tr>
+      <w:tr>
+        <w:tc>
+          <w:tcPr>
+            <w:tcW w:type="dxa" w:w="2494"/>
+          </w:tcPr>
+          <w:p>
+            <w:r>
+              <w:rPr>
+                <w:sz w:val="17"/>
+                <w:b w:val="0"/>
+              </w:rPr>
+              <w:t xml:space="preserve">E1 SHAP vs Diebold–Yilmaz spillovers</w:t>
+            </w:r>
+          </w:p>
+        </w:tc>
+        <w:tc>
+          <w:tcPr>
+            <w:tcW w:type="dxa" w:w="2608"/>
+          </w:tcPr>
+          <w:p>
+            <w:r>
+              <w:rPr>
+                <w:sz w:val="17"/>
+                <w:b w:val="0"/>
+              </w:rPr>
+              <w:t xml:space="preserve">Diebold &amp; Yilmaz (2012); Pesaran &amp; Shin (1998); Forbes &amp; Rigobon (2002) on what co-movement measures mean</w:t>
+            </w:r>
+          </w:p>
+        </w:tc>
+        <w:tc>
+          <w:tcPr>
+            <w:tcW w:type="dxa" w:w="2154"/>
+          </w:tcPr>
+          <w:p>
+            <w:r>
+              <w:rPr>
+                <w:sz w:val="17"/>
+                <w:b w:val="0"/>
+              </w:rPr>
+              <w:t xml:space="preserve">Descriptive comparison (8 sign checks, 5 rankings); no pass/fail</w:t>
+            </w:r>
+          </w:p>
+        </w:tc>
+        <w:tc>
+          <w:tcPr>
+            <w:tcW w:type="dxa" w:w="2381"/>
+          </w:tcPr>
+          <w:p>
+            <w:r>
+              <w:rPr>
+                <w:sz w:val="17"/>
+                <w:b w:val="0"/>
+              </w:rPr>
+              <w:t xml:space="preserve">— (no test; disagreement is itself informative)</w:t>
+            </w:r>
+          </w:p>
+        </w:tc>
+      </w:tr>
+      <w:tr>
+        <w:tc>
+          <w:tcPr>
+            <w:tcW w:type="dxa" w:w="2494"/>
+          </w:tcPr>
+          <w:p>
+            <w:r>
+              <w:rPr>
+                <w:sz w:val="17"/>
+                <w:b w:val="0"/>
+              </w:rPr>
+              <w:t xml:space="preserve">E2 volatility paradox</w:t>
+            </w:r>
+          </w:p>
+        </w:tc>
+        <w:tc>
+          <w:tcPr>
+            <w:tcW w:type="dxa" w:w="2608"/>
+          </w:tcPr>
+          <w:p>
+            <w:r>
+              <w:rPr>
+                <w:sz w:val="17"/>
+                <w:b w:val="0"/>
+              </w:rPr>
+              <w:t xml:space="preserve">Danielsson, Valenzuela &amp; Zer (2018); Minsky (1992); Hodrick &amp; Prescott (1997)</w:t>
+            </w:r>
+          </w:p>
+        </w:tc>
+        <w:tc>
+          <w:tcPr>
+            <w:tcW w:type="dxa" w:w="2154"/>
+          </w:tcPr>
+          <w:p>
+            <w:r>
+              <w:rPr>
+                <w:sz w:val="17"/>
+                <w:b w:val="0"/>
+              </w:rPr>
+              <w:t xml:space="preserve">Unusual calm (bottom 20%) before the GFC in Ireland and the US; not before COVID-19</w:t>
+            </w:r>
+          </w:p>
+        </w:tc>
+        <w:tc>
+          <w:tcPr>
+            <w:tcW w:type="dxa" w:w="2381"/>
+          </w:tcPr>
+          <w:p>
+            <w:r>
+              <w:rPr>
+                <w:sz w:val="17"/>
+                <w:b w:val="0"/>
+              </w:rPr>
+              <w:t xml:space="preserve">No unusual calm before the GFC (what happened for Ireland and the US)</w:t>
             </w:r>
           </w:p>
         </w:tc>
@@ -5615,6 +6196,206 @@
             <w:r>
               <w:rPr>
                 <w:sz w:val="15"/>
+                <w:b w:val="0"/>
+              </w:rPr>
+              <w:t xml:space="preserve">Diebold &amp; Yilmaz (2012)</w:t>
+            </w:r>
+          </w:p>
+        </w:tc>
+        <w:tc>
+          <w:tcPr>
+            <w:tcW w:type="dxa" w:w="1587"/>
+          </w:tcPr>
+          <w:p>
+            <w:r>
+              <w:rPr>
+                <w:sz w:val="15"/>
+                <w:b w:val="0"/>
+              </w:rPr>
+              <w:t xml:space="preserve">US stocks, bonds, FX, commodities; daily, Jan 1999 – Jan 2010</w:t>
+            </w:r>
+          </w:p>
+        </w:tc>
+        <w:tc>
+          <w:tcPr>
+            <w:tcW w:type="dxa" w:w="907"/>
+          </w:tcPr>
+          <w:p>
+            <w:r>
+              <w:rPr>
+                <w:sz w:val="15"/>
+                <w:b w:val="0"/>
+              </w:rPr>
+              <w:t xml:space="preserve">GFC</w:t>
+            </w:r>
+          </w:p>
+        </w:tc>
+        <w:tc>
+          <w:tcPr>
+            <w:tcW w:type="dxa" w:w="1361"/>
+          </w:tcPr>
+          <w:p>
+            <w:r>
+              <w:rPr>
+                <w:sz w:val="15"/>
+                <w:b w:val="0"/>
+              </w:rPr>
+              <w:t xml:space="preserve">Generalized VAR variance decomposition; 200-day rolling</w:t>
+            </w:r>
+          </w:p>
+        </w:tc>
+        <w:tc>
+          <w:tcPr>
+            <w:tcW w:type="dxa" w:w="1928"/>
+          </w:tcPr>
+          <w:p>
+            <w:r>
+              <w:rPr>
+                <w:sz w:val="15"/>
+                <w:b w:val="0"/>
+              </w:rPr>
+              <w:t xml:space="preserve">Spillovers limited until 2007; after Lehman large spillovers from stocks to other markets; full-sample total 12.6%</w:t>
+            </w:r>
+          </w:p>
+        </w:tc>
+        <w:tc>
+          <w:tcPr>
+            <w:tcW w:type="dxa" w:w="1247"/>
+          </w:tcPr>
+          <w:p>
+            <w:r>
+              <w:rPr>
+                <w:sz w:val="15"/>
+                <w:b w:val="0"/>
+              </w:rPr>
+              <w:t xml:space="preserve">E1 method</w:t>
+            </w:r>
+          </w:p>
+        </w:tc>
+        <w:tc>
+          <w:tcPr>
+            <w:tcW w:type="dxa" w:w="1247"/>
+          </w:tcPr>
+          <w:p>
+            <w:r>
+              <w:rPr>
+                <w:sz w:val="15"/>
+                <w:b w:val="0"/>
+              </w:rPr>
+              <w:t xml:space="preserve">Linear; US asset classes only</w:t>
+            </w:r>
+          </w:p>
+        </w:tc>
+      </w:tr>
+      <w:tr>
+        <w:tc>
+          <w:tcPr>
+            <w:tcW w:type="dxa" w:w="1361"/>
+          </w:tcPr>
+          <w:p>
+            <w:r>
+              <w:rPr>
+                <w:sz w:val="15"/>
+                <w:b w:val="0"/>
+              </w:rPr>
+              <w:t xml:space="preserve">Danielsson, Valenzuela &amp; Zer (2018)</w:t>
+            </w:r>
+          </w:p>
+        </w:tc>
+        <w:tc>
+          <w:tcPr>
+            <w:tcW w:type="dxa" w:w="1587"/>
+          </w:tcPr>
+          <w:p>
+            <w:r>
+              <w:rPr>
+                <w:sz w:val="15"/>
+                <w:b w:val="0"/>
+              </w:rPr>
+              <w:t xml:space="preserve">60 countries, up to 211 years, monthly real returns</w:t>
+            </w:r>
+          </w:p>
+        </w:tc>
+        <w:tc>
+          <w:tcPr>
+            <w:tcW w:type="dxa" w:w="907"/>
+          </w:tcPr>
+          <w:p>
+            <w:r>
+              <w:rPr>
+                <w:sz w:val="15"/>
+                <w:b w:val="0"/>
+              </w:rPr>
+              <w:t xml:space="preserve">259 banking crises</w:t>
+            </w:r>
+          </w:p>
+        </w:tc>
+        <w:tc>
+          <w:tcPr>
+            <w:tcW w:type="dxa" w:w="1361"/>
+          </w:tcPr>
+          <w:p>
+            <w:r>
+              <w:rPr>
+                <w:sz w:val="15"/>
+                <w:b w:val="0"/>
+              </w:rPr>
+              <w:t xml:space="preserve">One-sided HP trend; panel logit</w:t>
+            </w:r>
+          </w:p>
+        </w:tc>
+        <w:tc>
+          <w:tcPr>
+            <w:tcW w:type="dxa" w:w="1928"/>
+          </w:tcPr>
+          <w:p>
+            <w:r>
+              <w:rPr>
+                <w:sz w:val="15"/>
+                <w:b w:val="0"/>
+              </w:rPr>
+              <w:t xml:space="preserve">Prolonged low volatility predicts crises (1% below trend for 5 years → +1.01% crisis probability); level of volatility does not</w:t>
+            </w:r>
+          </w:p>
+        </w:tc>
+        <w:tc>
+          <w:tcPr>
+            <w:tcW w:type="dxa" w:w="1247"/>
+          </w:tcPr>
+          <w:p>
+            <w:r>
+              <w:rPr>
+                <w:sz w:val="15"/>
+                <w:b w:val="0"/>
+              </w:rPr>
+              <w:t xml:space="preserve">E2 method; Minsky anchor</w:t>
+            </w:r>
+          </w:p>
+        </w:tc>
+        <w:tc>
+          <w:tcPr>
+            <w:tcW w:type="dxa" w:w="1247"/>
+          </w:tcPr>
+          <w:p>
+            <w:r>
+              <w:rPr>
+                <w:sz w:val="15"/>
+                <w:b w:val="0"/>
+              </w:rPr>
+              <w:t xml:space="preserve">Annual data; banking crises only</w:t>
+            </w:r>
+          </w:p>
+        </w:tc>
+      </w:tr>
+      <w:tr>
+        <w:tc>
+          <w:tcPr>
+            <w:tcW w:type="dxa" w:w="1361"/>
+          </w:tcPr>
+          <w:p>
+            <w:r>
+              <w:rPr>
+                <w:sz w:val="15"/>
               </w:rPr>
               <w:t>(your next paper)</w:t>
             </w:r>
@@ -6118,7 +6899,7 @@
               <w:rPr>
                 <w:sz w:val="17"/>
               </w:rPr>
-              <w:t>Draft 2.2–2.4 (also feeds your Hardiman research statement)</w:t>
+              <w:t>Draft 2.2–2.4</w:t>
             </w:r>
           </w:p>
         </w:tc>
@@ -6201,6 +6982,50 @@
                 <w:sz w:val="17"/>
               </w:rPr>
               <w:t>Polish the whole chapter; update the gap with your actual design</w:t>
+            </w:r>
+          </w:p>
+        </w:tc>
+      </w:tr>
+      <w:tr>
+        <w:tc>
+          <w:tcPr>
+            <w:tcW w:type="dxa" w:w="850"/>
+          </w:tcPr>
+          <w:p>
+            <w:r>
+              <w:rPr>
+                <w:sz w:val="17"/>
+                <w:b w:val="0"/>
+              </w:rPr>
+              <w:t xml:space="preserve">Now (Oct)</w:t>
+            </w:r>
+          </w:p>
+        </w:tc>
+        <w:tc>
+          <w:tcPr>
+            <w:tcW w:type="dxa" w:w="5669"/>
+          </w:tcPr>
+          <w:p>
+            <w:r>
+              <w:rPr>
+                <w:sz w:val="17"/>
+                <w:b w:val="0"/>
+              </w:rPr>
+              <w:t xml:space="preserve">Diebold &amp; Yilmaz (2012) pp.57–61; Pesaran &amp; Shin (1998); Danielsson et al. (2018) pp.3–6, 13–14, 19–22 (accepted version); Feng et al. (2026); Brini (2026)</w:t>
+            </w:r>
+          </w:p>
+        </w:tc>
+        <w:tc>
+          <w:tcPr>
+            <w:tcW w:type="dxa" w:w="3118"/>
+          </w:tcPr>
+          <w:p>
+            <w:r>
+              <w:rPr>
+                <w:sz w:val="17"/>
+                <w:b w:val="0"/>
+              </w:rPr>
+              <w:t xml:space="preserve">Method notes for the exploratory section of Chapter 3</w:t>
             </w:r>
           </w:p>
         </w:tc>
@@ -6266,6 +7091,18 @@
         <w:rPr>
           <w:sz w:val="19"/>
         </w:rPr>
+        <w:t xml:space="preserve">✔ Danielsson, J., Valenzuela, M. and Zer, I. (2018) Learning from history: volatility and financial crises. Review of Financial Studies, 31(7), 2774–2805.</w:t>
+      </w:r>
+    </w:p>
+    <w:p>
+      <w:pPr>
+        <w:spacing w:after="40"/>
+        <w:ind w:left="454" w:hanging="454"/>
+      </w:pPr>
+      <w:r>
+        <w:rPr>
+          <w:sz w:val="19"/>
+        </w:rPr>
         <w:t>Fama, E. (1970) Efficient capital markets: a review of theory and empirical work. Journal of Finance, 25(2), 383–417.</w:t>
       </w:r>
     </w:p>
@@ -6421,6 +7258,18 @@
         <w:rPr>
           <w:sz w:val="19"/>
         </w:rPr>
+        <w:t xml:space="preserve">✔ Gallagher, L. and Twomey, C. (1998) Identifying the source of mean and volatility spillovers in Irish equities: a multivariate GARCH analysis. The Economic and Social Review, 29(4), 341–356.</w:t>
+      </w:r>
+    </w:p>
+    <w:p>
+      <w:pPr>
+        <w:spacing w:after="40"/>
+        <w:ind w:left="454" w:hanging="454"/>
+      </w:pPr>
+      <w:r>
+        <w:rPr>
+          <w:sz w:val="19"/>
+        </w:rPr>
         <w:t>Honohan, P. (2010) The Irish Banking Crisis: Regulatory and Financial Stability Policy 2003–2008. Dublin: Central Bank of Ireland.</w:t>
       </w:r>
     </w:p>
@@ -6517,18 +7366,6 @@
         <w:rPr>
           <w:sz w:val="19"/>
         </w:rPr>
-        <w:t>✔ (partial) Twomey, C. (1998) Identifying the source of mean and volatility spillovers in Irish equities: a multivariate GARCH analysis. The Economic and Social Review. [confirm volume and pages]</w:t>
-      </w:r>
-    </w:p>
-    <w:p>
-      <w:pPr>
-        <w:spacing w:after="40"/>
-        <w:ind w:left="454" w:hanging="454"/>
-      </w:pPr>
-      <w:r>
-        <w:rPr>
-          <w:sz w:val="19"/>
-        </w:rPr>
         <w:t>✔ Whelan, K. (2014) Ireland’s economic crisis: the good, the bad and the ugly. Journal of Macroeconomics, 39(B), 424–440.</w:t>
       </w:r>
     </w:p>
@@ -6576,7 +7413,7 @@
         <w:rPr>
           <w:sz w:val="19"/>
         </w:rPr>
-        <w:t>Diebold, F. and Yilmaz, K. (2012) Better to give than to receive. International Journal of Forecasting, 28(1), 57–66.</w:t>
+        <w:t xml:space="preserve">✔ Diebold, F. and Yilmaz, K. (2012) Better to give than to receive: predictive directional measurement of volatility spillovers. International Journal of Forecasting, 28(1), 57–66.</w:t>
       </w:r>
     </w:p>
     <w:p>
@@ -6743,6 +7580,18 @@
         <w:rPr>
           <w:sz w:val="19"/>
         </w:rPr>
+        <w:t xml:space="preserve">✔ Brini, A. (2026) Forecasting realized volatility with time series foundation models: a comparison with econometric benchmarks. arXiv preprint 2607.05291.</w:t>
+      </w:r>
+    </w:p>
+    <w:p>
+      <w:pPr>
+        <w:spacing w:after="40"/>
+        <w:ind w:left="454" w:hanging="454"/>
+      </w:pPr>
+      <w:r>
+        <w:rPr>
+          <w:sz w:val="19"/>
+        </w:rPr>
         <w:t>✔ Bucci, A. (2020) Realized volatility forecasting with neural networks. Journal of Financial Econometrics, 18(3), 502–531.</w:t>
       </w:r>
     </w:p>
@@ -6946,6 +7795,18 @@
         <w:rPr>
           <w:sz w:val="19"/>
         </w:rPr>
+        <w:t xml:space="preserve">✔ Feng, L., Shi, J. and Kutan, A. (2026) Your fear is (partly) mine: the role of non-VIX volatility in forecasting regional stock market volatility using interpretable machine learning. Journal of International Money and Finance, 160, 103467.</w:t>
+      </w:r>
+    </w:p>
+    <w:p>
+      <w:pPr>
+        <w:spacing w:after="40"/>
+        <w:ind w:left="454" w:hanging="454"/>
+      </w:pPr>
+      <w:r>
+        <w:rPr>
+          <w:sz w:val="19"/>
+        </w:rPr>
         <w:t>Kumar, I. et al. (2020) Problems with Shapley-value-based explanations as feature importance measures. Proceedings of ICML.</w:t>
       </w:r>
     </w:p>
@@ -6995,6 +7856,77 @@
           <w:sz w:val="19"/>
         </w:rPr>
         <w:t>Sundararajan, M., Taly, A. and Yan, Q. (2017) Axiomatic attribution for deep networks. Proceedings of ICML.</w:t>
+      </w:r>
+    </w:p>
+    <w:p>
+      <w:pPr>
+        <w:pStyle w:val="Heading3"/>
+      </w:pPr>
+      <w:r>
+        <w:rPr>
+          <w:color w:val="1F4E79"/>
+        </w:rPr>
+        <w:t xml:space="preserve">Exploratory extensions (Chapter 3; not Chapter 2)</w:t>
+      </w:r>
+    </w:p>
+    <w:p>
+      <w:pPr>
+        <w:spacing w:after="40"/>
+        <w:ind w:left="454" w:hanging="454"/>
+      </w:pPr>
+      <w:r>
+        <w:rPr>
+          <w:sz w:val="19"/>
+        </w:rPr>
+        <w:t xml:space="preserve">Antonakakis, N., Chatziantoniou, I. and Gabauer, D. (2020) Refined measures of dynamic connectedness based on time-varying parameter vector autoregressions. Journal of Risk and Financial Management, 13(4), 84.</w:t>
+      </w:r>
+    </w:p>
+    <w:p>
+      <w:pPr>
+        <w:spacing w:after="40"/>
+        <w:ind w:left="454" w:hanging="454"/>
+      </w:pPr>
+      <w:r>
+        <w:rPr>
+          <w:sz w:val="19"/>
+        </w:rPr>
+        <w:t xml:space="preserve">✔ Diebold, F. and Yilmaz, K. (2012) — see 2.4.</w:t>
+      </w:r>
+    </w:p>
+    <w:p>
+      <w:pPr>
+        <w:spacing w:after="40"/>
+        <w:ind w:left="454" w:hanging="454"/>
+      </w:pPr>
+      <w:r>
+        <w:rPr>
+          <w:sz w:val="19"/>
+        </w:rPr>
+        <w:t xml:space="preserve">✔ Danielsson, J., Valenzuela, M. and Zer, I. (2018) — see 2.2.</w:t>
+      </w:r>
+    </w:p>
+    <w:p>
+      <w:pPr>
+        <w:spacing w:after="40"/>
+        <w:ind w:left="454" w:hanging="454"/>
+      </w:pPr>
+      <w:r>
+        <w:rPr>
+          <w:sz w:val="19"/>
+        </w:rPr>
+        <w:t xml:space="preserve">Hodrick, R. and Prescott, E. (1997) Postwar U.S. business cycles: an empirical investigation. Journal of Money, Credit and Banking, 29(1), 1–16.</w:t>
+      </w:r>
+    </w:p>
+    <w:p>
+      <w:pPr>
+        <w:spacing w:after="40"/>
+        <w:ind w:left="454" w:hanging="454"/>
+      </w:pPr>
+      <w:r>
+        <w:rPr>
+          <w:sz w:val="19"/>
+        </w:rPr>
+        <w:t xml:space="preserve">Pesaran, M.H. and Shin, Y. (1998) Generalized impulse response analysis in linear multivariate models. Economics Letters, 58(1), 17–29.</w:t>
       </w:r>
     </w:p>
     <w:sectPr>

</xml_diff>